<commit_message>
Updated README, drafted summary
</commit_message>
<xml_diff>
--- a/papers/P1_Draft_summary.docx
+++ b/papers/P1_Draft_summary.docx
@@ -47,7 +47,6 @@
         </w:rPr>
         <w:t xml:space="preserve">A Scenario-Based </w:t>
       </w:r>
-      <w:proofErr w:type="spellStart"/>
       <w:r>
         <w:rPr>
           <w:b/>
@@ -57,7 +56,6 @@
         </w:rPr>
         <w:t>Sensitiv</w:t>
       </w:r>
-      <w:proofErr w:type="spellEnd"/>
       <w:r>
         <w:rPr>
           <w:b/>
@@ -65,7 +63,7 @@
           <w:sz w:val="20"/>
           <w:szCs w:val="20"/>
         </w:rPr>
-        <w:t xml:space="preserve"> </w:t>
+        <w:t xml:space="preserve">e </w:t>
       </w:r>
       <w:r>
         <w:rPr>
@@ -78,229 +76,99 @@
       </w:r>
     </w:p>
     <w:p>
-      <w:pPr>
-        <w:rPr>
-          <w:b/>
-          <w:bCs/>
-        </w:rPr>
-      </w:pPr>
-      <w:r>
-        <w:rPr>
-          <w:b/>
-          <w:bCs/>
-        </w:rPr>
-        <w:t>1. SUMMARY</w:t>
+      <w:r>
+        <w:t>As energy producers</w:t>
+      </w:r>
+      <w:r>
+        <w:t xml:space="preserve"> rapidly</w:t>
+      </w:r>
+      <w:r>
+        <w:t xml:space="preserve"> shift to</w:t>
+      </w:r>
+      <w:r>
+        <w:t xml:space="preserve">wards </w:t>
+      </w:r>
+      <w:r>
+        <w:t>renewable energy resources, such as solar and wind,</w:t>
+      </w:r>
+      <w:r>
+        <w:t xml:space="preserve"> power grids are faced with new operational challenges due to the variability of intermittent weather-based generation. In this study we examine how increasing renewable penetration impacts net load dynamics and ramp risks within a power system.</w:t>
       </w:r>
     </w:p>
     <w:p>
       <w:r>
-        <w:t xml:space="preserve">Increasing </w:t>
-      </w:r>
-      <w:r>
-        <w:t xml:space="preserve">penetration of </w:t>
-      </w:r>
-      <w:r>
-        <w:t xml:space="preserve">renewable energy </w:t>
-      </w:r>
-      <w:r>
-        <w:t xml:space="preserve">resources </w:t>
-      </w:r>
-      <w:r>
-        <w:t xml:space="preserve">such as solar and wind has introduced new challenges </w:t>
-      </w:r>
-      <w:r>
-        <w:t>to electricity power systems</w:t>
-      </w:r>
-      <w:r>
-        <w:t xml:space="preserve"> due to their variability and intermittency</w:t>
-      </w:r>
-      <w:r>
-        <w:t xml:space="preserve"> nature</w:t>
-      </w:r>
-      <w:r>
-        <w:t xml:space="preserve">. </w:t>
-      </w:r>
-      <w:r>
-        <w:t>In this research we investigate</w:t>
-      </w:r>
-      <w:r>
-        <w:t xml:space="preserve"> how increasing renewable penetration </w:t>
-      </w:r>
-      <w:r>
-        <w:t>would impact</w:t>
-      </w:r>
-      <w:r>
-        <w:t xml:space="preserve"> net load behavior and ramping risk in a power system context.</w:t>
+        <w:t xml:space="preserve">The hypothesis was that the increased renewable penetration would amplify both the magnitude and frequency of extreme net load ramp events due to the </w:t>
+      </w:r>
+      <w:r>
+        <w:t>net variability of both solar and wind generation.</w:t>
       </w:r>
     </w:p>
     <w:p>
       <w:r>
-        <w:t xml:space="preserve">The </w:t>
-      </w:r>
-      <w:r>
-        <w:t>hypothesi</w:t>
-      </w:r>
-      <w:r>
-        <w:t>s was</w:t>
-      </w:r>
-      <w:r>
-        <w:t xml:space="preserve"> that higher renewable penetration would increase </w:t>
-      </w:r>
-      <w:r>
-        <w:t xml:space="preserve">both </w:t>
-      </w:r>
-      <w:r>
-        <w:t>the magnitude and frequency of extreme net load ramp events due to increased variability in solar and wind generation.</w:t>
+        <w:t xml:space="preserve">To test the hypothesis, we constructed net load profiles based on </w:t>
+      </w:r>
+      <w:proofErr w:type="gramStart"/>
+      <w:r>
+        <w:t>hypothetical</w:t>
+      </w:r>
+      <w:proofErr w:type="gramEnd"/>
+      <w:r>
+        <w:t xml:space="preserve"> constructed penetration scenarios</w:t>
+      </w:r>
+      <w:r>
+        <w:t>; ea</w:t>
+      </w:r>
+      <w:r>
+        <w:t>ch scenario</w:t>
+      </w:r>
+      <w:r>
+        <w:t xml:space="preserve"> was derived from </w:t>
+      </w:r>
+      <w:r>
+        <w:t>recent hourly load, solar, and wind generation data from the Electric Reliability Council of Texas (ERCOT). We scaled the solar and wind generation incrementally t</w:t>
+      </w:r>
+      <w:r>
+        <w:t>o simulate each scenario effectively while maintaining historical weather patterns</w:t>
+      </w:r>
+      <w:r>
+        <w:t>.</w:t>
+      </w:r>
+      <w:r>
+        <w:t xml:space="preserve"> Finally, ramping risk is calculated via net load ramping rates, conditional tail expectation (CTE), and extreme ramp event magnitude.</w:t>
       </w:r>
     </w:p>
     <w:p>
       <w:r>
-        <w:t>We tested our hypothesis by developing net load profiles based upon different “what if” renewable penetration scenarios</w:t>
-      </w:r>
-      <w:r>
-        <w:t>,</w:t>
-      </w:r>
-      <w:r>
-        <w:t xml:space="preserve"> using most recent year’s</w:t>
-      </w:r>
-      <w:r>
-        <w:t xml:space="preserve"> hourly load, solar, and wind generation data</w:t>
-      </w:r>
-      <w:r>
-        <w:t xml:space="preserve"> published by ERCOT</w:t>
-      </w:r>
-      <w:r>
-        <w:t xml:space="preserve">. </w:t>
-      </w:r>
-      <w:r>
-        <w:t xml:space="preserve">Solar and wind generation were scaled incrementally to </w:t>
-      </w:r>
-      <w:r>
-        <w:t>simulate each “what if” renewable penetration scenario</w:t>
-      </w:r>
-      <w:r>
-        <w:t xml:space="preserve"> </w:t>
-      </w:r>
-      <w:r>
-        <w:t xml:space="preserve">while maintaining </w:t>
-      </w:r>
-      <w:r>
-        <w:t>variability</w:t>
-      </w:r>
-      <w:r>
-        <w:t xml:space="preserve"> patterns</w:t>
-      </w:r>
-      <w:r>
-        <w:t>.</w:t>
-      </w:r>
-      <w:r>
-        <w:t xml:space="preserve"> Ramping risk was quantified by calculating net load ramping rates, c</w:t>
-      </w:r>
-      <w:r>
-        <w:t xml:space="preserve">onditional </w:t>
-      </w:r>
-      <w:r>
-        <w:t>t</w:t>
-      </w:r>
-      <w:r>
-        <w:t xml:space="preserve">ail Expectation </w:t>
-      </w:r>
-      <w:r>
-        <w:t>and extreme ramp event</w:t>
-      </w:r>
-      <w:r>
-        <w:t>’s magnitude.</w:t>
-      </w:r>
-      <w:r>
-        <w:t xml:space="preserve"> </w:t>
+        <w:t xml:space="preserve">From the results, we can conclude that higher renewable penetration </w:t>
+      </w:r>
+      <w:r>
+        <w:t>leads to deeper midday net load reductions and increased net load ramp variability. Extreme ramping events occur more frequently with the increased capacity of renewable energy; as a result, tail-risk metrics reveal increased chances of rare, high-impact system stress events. Note that we observed the relationship between renewable penetration and ramping risk to be nonlinear; increased solar generation has a significantly greater impact on extreme net load ramps, especially during sunset hours.</w:t>
       </w:r>
     </w:p>
     <w:p>
       <w:r>
-        <w:t xml:space="preserve">The results show that increasing renewable penetration leads to deeper midday net load reductions, increased </w:t>
-      </w:r>
-      <w:r>
-        <w:t xml:space="preserve">overall </w:t>
-      </w:r>
-      <w:r>
-        <w:t xml:space="preserve">variability in </w:t>
-      </w:r>
-      <w:r>
-        <w:t xml:space="preserve">net load </w:t>
-      </w:r>
-      <w:r>
-        <w:t xml:space="preserve">ramp behavior. Extreme ramp events occur more frequently under high renewable scenarios, and tail-risk metrics indicate increased exposure to rare but high-impact system stress events. The relationship between renewable penetration and ramping risk is observed to be nonlinear, with solar generation contributing more strongly to extreme upward </w:t>
-      </w:r>
-      <w:r>
-        <w:t xml:space="preserve">net load </w:t>
-      </w:r>
-      <w:r>
-        <w:t>ramp behavior than wind</w:t>
-      </w:r>
-      <w:r>
-        <w:t xml:space="preserve"> during sunset hours</w:t>
-      </w:r>
-      <w:r>
-        <w:t>.</w:t>
+        <w:t>This study shows that the</w:t>
+      </w:r>
+      <w:r>
+        <w:t xml:space="preserve"> growth of renewable energy has </w:t>
+      </w:r>
+      <w:r>
+        <w:t xml:space="preserve">structurally </w:t>
+      </w:r>
+      <w:r>
+        <w:t>altered net load dynamics</w:t>
+      </w:r>
+      <w:r>
+        <w:t xml:space="preserve"> by </w:t>
+      </w:r>
+      <w:r>
+        <w:t>increasing requirements for system flexibility.</w:t>
+      </w:r>
+      <w:r>
+        <w:t xml:space="preserve"> Future power grids will require a higher level of flexible generation resources and energy storage systems to accommodate steeper ramping requirements, ensuring grid stability.</w:t>
       </w:r>
     </w:p>
-    <w:p>
-      <w:r>
-        <w:t xml:space="preserve">This </w:t>
-      </w:r>
-      <w:r>
-        <w:t>research</w:t>
-      </w:r>
-      <w:r>
-        <w:t xml:space="preserve"> demonstrates that renewable growth fundamentally alters net load dynamics and increases system flexibility requirements. More flexible generation resources and energy storage systems will be needed to accommodate steeper ramping requirements in </w:t>
-      </w:r>
-      <w:r>
-        <w:t xml:space="preserve">high </w:t>
-      </w:r>
-      <w:r>
-        <w:t>renewable power systems.</w:t>
-      </w:r>
-    </w:p>
-    <w:p>
-      <w:r>
-        <w:rPr>
-          <w:highlight w:val="yellow"/>
-        </w:rPr>
-        <w:t>Version #</w:t>
-      </w:r>
-      <w:proofErr w:type="gramStart"/>
-      <w:r>
-        <w:rPr>
-          <w:highlight w:val="yellow"/>
-        </w:rPr>
-        <w:t>2 :</w:t>
-      </w:r>
-      <w:proofErr w:type="gramEnd"/>
-    </w:p>
-    <w:p>
-      <w:r>
-        <w:t xml:space="preserve">The rapid integration of solar and wind resources introduces significant operational challenges to power grids, primarily due to the inherent variability and intermittency of weather-dependent generation. This study examines how increasing renewable penetration alters net load dynamics and exacerbates ramping risks within a power system framework. We hypothesized that higher shares of renewable energy would increase both </w:t>
-      </w:r>
-      <w:r>
-        <w:lastRenderedPageBreak/>
-        <w:t>the magnitude and frequency of extreme net load ramp events, driven by the compounded variability of solar and wind outputs.</w:t>
-      </w:r>
-    </w:p>
-    <w:p>
-      <w:r>
-        <w:t>To test this hypothesis, we constructed net load profiles across several hypothetical penetration scenarios. The models utilize recent hourly load, solar, and wind generation data from the Electric Reliability Council of Texas (ERCOT). To simulate these scenarios while preserving historical weather and volatility patterns, we scaled the solar and wind generation data incrementally. We then quantified ramping risk using three primary metrics: net load ramping rates, conditional tail expectation (CTE), and the absolute magnitude of extreme ramp events.</w:t>
-      </w:r>
-    </w:p>
-    <w:p>
-      <w:r>
-        <w:t>Our findings indicate that higher renewable penetration deepens the midday net load trough and increases overall ramp volatility. Extreme ramping events become more frequent as renewable capacity grows. Furthermore, tail-risk metrics reveal a heightened exposure to rare, high-impact system stress events. Notably, the relationship between renewable penetration and ramping risk is nonlinear; solar generation exerts a more pronounced influence on extreme upward net load ramps than wind, particularly during sunset hours.</w:t>
-      </w:r>
-    </w:p>
-    <w:p>
-      <w:r>
-        <w:t>Ultimately, this analysis demonstrates that renewable growth fundamentally alters net load dynamics, thereby increasing the demand for grid flexibility. To accommodate these steeper ramping requirements and ensure grid stability, future power systems will require a higher composition of flexible generation resources and utility-scale energy storage systems.</w:t>
-      </w:r>
-    </w:p>
+    <w:p/>
     <w:p/>
     <w:sectPr>
       <w:pgSz w:w="12240" w:h="15840"/>
@@ -916,6 +784,7 @@
   <w:style w:type="character" w:default="1" w:styleId="DefaultParagraphFont">
     <w:name w:val="Default Paragraph Font"/>
     <w:uiPriority w:val="1"/>
+    <w:semiHidden/>
     <w:unhideWhenUsed/>
   </w:style>
   <w:style w:type="table" w:default="1" w:styleId="TableNormal">

</xml_diff>